<commit_message>
Sync project updates and BatteryWatch 0.2.11 APK
</commit_message>
<xml_diff>
--- a/KoreanStockBot/KoreanStockBot_사용매뉴얼.docx
+++ b/KoreanStockBot/KoreanStockBot_사용매뉴얼.docx
@@ -1393,6 +1393,38 @@
         <w:pStyle w:val="Normal"/>
       </w:pPr>
       <w:r>
+        <w:t xml:space="preserve">수집 단계와 오류는 실행파일 폴더의 research/logs/collection.log에 자동 기록됩니다. 메모장으로 열면 time(한국시간), run_id(작업 ID), stage(현재 단계), START/COMPLETED/FAILED(시작/완료/실패), error_code(오류 분류), http_status(HTTP 코드)를 확인할 수 있습니다. 로그는 2MB마다 순환하며 이전 파일은 최대 5개 보관합니다. 키·비밀번호·URL·헤더·원문 오류 메시지는 기록하지 않습니다. 화면의 미요청 상태는 키 오류가 아니라 아직 해당 단계에 도달하지 않았다는 뜻이며, 앞 단계 실패인 경우 별도로 표시합니다.</w:t>
+      </w:r>
+    </w:p>
+    <w:p>
+      <w:pPr>
+        <w:pStyle w:val="Normal"/>
+      </w:pPr>
+      <w:r>
+        <w:t xml:space="preserve">ETF 후보 제안은 중복된 순위 범위 대신 실제 종목 목록을 보여줍니다. 봇 중지 완료 후 창을 열면 최신 계좌·시세를 읽기 전용으로 조회합니다. 자동 수집된 재무·뉴스 자료와 추세를 검사해 통과 종목을 추천하고, 제외 종목에는 사유를 표시합니다. 추천 종목을 클릭해 선택/해제 → 선택한 종목 적용 → 실전 시작 순서로 사용하세요. 선택한 종목들 안에서 한 번에 한 종목을 운용합니다. 분석 후 5분이 지나면 다시 조회해야 적용할 수 있습니다. 실제 주문 전 조건을 재검사하며, 기존 보유분의 매도 조건은 유지합니다. 조회 실패 시 읽기 전용 점검으로 자동 자료 수집 상태를 확인하세요. 장외 시세가 오래됐으면 후보를 추천하지 않습니다.</w:t>
+      </w:r>
+    </w:p>
+    <w:p>
+      <w:pPr>
+        <w:pStyle w:val="Normal"/>
+      </w:pPr>
+      <w:r>
+        <w:t xml:space="preserve">ETF 후보 없음 안내에는 관리 현금·투자 비중·주문 상한·계좌 현금매수가능 금액과 후보별 제외 사유가 표시됩니다. 재무점수와 확인 비중의 기준은 각각 60%이며, 뉴스와 추세도 확인합니다. 1주 필요 추정은 현재가 × 1.01 + 10원으로 계산합니다. 전체 후보 사유는 아래 스크롤 로그에서 확인하세요. 안내는 예산이나 조건을 자동 변경하지 않습니다.</w:t>
+      </w:r>
+    </w:p>
+    <w:p>
+      <w:pPr>
+        <w:pStyle w:val="Normal"/>
+      </w:pPr>
+      <w:r>
+        <w:t xml:space="preserve">자료 수집 상태에서는 KRX·DART·NAVER의 API 성공, 캐시 사용, 오류 횟수와 기록 시각을 확인합니다. 캐시는 이번 키의 인증 성공을 검증하지 않습니다. READY는 분석 파일이 완성되었다는 뜻이며 매수 조건 통과 개수는 별도로 표시합니다. 업데이트 전 수집 이력은 상세 기록 없음으로 표시하며 다음 자동 수집부터 기록됩니다.</w:t>
+      </w:r>
+    </w:p>
+    <w:p>
+      <w:pPr>
+        <w:pStyle w:val="Normal"/>
+      </w:pPr>
+      <w:r>
         <w:t xml:space="preserve">실전 시작 후 실행 상태 영역에서 휴장 대기·매매 시작 대기·매매시간 종료·연결 실패를 확인합니다. 휴장 중 신규 매수·매도 주문은 보내지 않습니다. 다음 개장 시각은 토스 시장 캘린더로 확인하며, 마지막 상태 수신 시각과 경과 초도 표시됩니다. 응답이 오래 없으면 응답 지연으로 표시합니다. 봇은 개장 2분 후부터 마감 동시호가 2분 전까지 조건을 확인하며, 개장만으로 매수하지 않습니다.</w:t>
       </w:r>
     </w:p>
@@ -1410,6 +1442,30 @@
       </w:pPr>
       <w:r>
         <w:t xml:space="preserve">중지 요청을 누르고 프로세스 종료를 확인하면 같은 창에서 실전 시작을 누를 수 있습니다. 동시에 다른 전략을 실행하지 않습니다.</w:t>
+      </w:r>
+    </w:p>
+    <w:p>
+      <w:pPr>
+        <w:pStyle w:val="Normal"/>
+      </w:pPr>
+      <w:r>
+        <w:t xml:space="preserve">우측 상단 프로그램 종료 버튼은 스크롤과 관계없이 표시됩니다. 누르면 진행 중인 조회 완료를 기다리고, 봇의 미체결 정리 및 정상 종료를 확인한 뒤 창을 닫습니다. 정상 중지 미확인 시 창을 유지하고 안내합니다. 보유분은 매도하지 않으며 자동 감시는 종료됩니다. 모의매매는 reports/paper_exit_시각 폴더에 결과를 자동 저장합니다. 창의 X 버튼도 같은 절차를 사용합니다.</w:t>
+      </w:r>
+    </w:p>
+    <w:p>
+      <w:pPr>
+        <w:pStyle w:val="Normal"/>
+      </w:pPr>
+      <w:r>
+        <w:t xml:space="preserve">최신 계좌·시세 조회 후 후보가 없으면 후보 제안 불가 사유 팝업이 표시됩니다. 시장 상태와 실제 제외 사유별 종목 수를 보여줍니다. 오래된 시세로 제외된 경우 다음 정규장 재조회를 안내하고, 분석 자료 만료·인증 또는 접근 거부·통신 실패 등은 구분해 안내합니다. 같은 내용을 하단 로그에서도 확인할 수 있습니다.</w:t>
+      </w:r>
+    </w:p>
+    <w:p>
+      <w:pPr>
+        <w:pStyle w:val="Normal"/>
+      </w:pPr>
+      <w:r>
+        <w:t xml:space="preserve">중지 요청 접수는 종료 완료가 아닙니다. 진행 중인 통신 응답 후 주문을 조회하고 미체결 정리를 확인합니다. 중지 요청 후 경과 시간이 표시되며 60초 이상이면 처리 지연 안내가 나옵니다. 정상 종료와 중지 완료 응답을 모두 확인해야 중지 완료로 표시합니다. 정상 중지 미확인 시 토스 앱에서 미체결·보유분을 확인하세요. 보유 종목은 자동 매도하지 않으며, 중지 후 자동 손절·익절 감시도 종료됩니다.</w:t>
       </w:r>
     </w:p>
     <w:p>

</xml_diff>